<commit_message>
fix: replace remaining "agency" wording with "contractor" everywhere
Missed in the previous refactor:
- Chat sidebar suggested questions (3 cards still said "agency")
  Also surfaced 2 new vendor performance prompts so leadership can
  see the new capability immediately.
- ZoneDetail inline comments (cosmetic).
- 2 Q&A answer texts that still mentioned "agency"/"agencies".

Regenerated 06.md, facts JSON, KB docx and PDF to match.

Co-Authored-By: Claude Opus 4.7 (1M context) <noreply@anthropic.com>
</commit_message>
<xml_diff>
--- a/MBS Road Control Tower/MBS-Road-Control-Tower-Knowledge-Base.docx
+++ b/MBS Road Control Tower/MBS-Road-Control-Tower-Knowledge-Base.docx
@@ -15284,7 +15284,7 @@
         <w:t xml:space="preserve"> </w:t>
       </w:r>
       <w:r>
-        <w:t xml:space="preserve">Work that cannot progress because of an external dependency (e.g., utility contractor not responding, owner notice unresolved, agency hand-off pending). These are the items the joint working room escalates first.</w:t>
+        <w:t xml:space="preserve">Work that cannot progress because of an external dependency (e.g., utility contractor not responding, owner notice unresolved, contractor hand-off pending). These are the items the joint working room escalates first.</w:t>
       </w:r>
     </w:p>
     <w:p>
@@ -15372,7 +15372,7 @@
         <w:t xml:space="preserve"> </w:t>
       </w:r>
       <w:r>
-        <w:t xml:space="preserve">Phase 1, port stretch, high distortion density. Workshops belt with damaged median barriers and asphalt deterioration. Multiple agencies involved (JM, RGA, GDCD, Investment).</w:t>
+        <w:t xml:space="preserve">Phase 1, port stretch, high distortion density. Workshops belt with damaged median barriers and asphalt deterioration. Multiple contractors involved (ARC, JM, RGA, GDCD, MAAS, TIP).</w:t>
       </w:r>
     </w:p>
     <w:p>

</xml_diff>